<commit_message>
Fix the press's warnings gate: checked selftest fixtures, dead code removed
Selftest fixtures wrote files without checking the result — the same
vacuous-fixture failure the proposal stores are guarded against — so the
writes now go through checked writeFixture/readFixture helpers and assert.
Removed the unused replaceOne convenience overload, two unused lambda
captures and the unused isTibetanCp helper. Build is warning-free;
102/102 suites green.

Co-Authored-By: Claude Opus 5 <noreply@anthropic.com>
</commit_message>
<xml_diff>
--- a/docs/digests/2026-09-09.draft.docx
+++ b/docs/digests/2026-09-09.draft.docx
@@ -2028,6 +2028,9 @@
   </w:docDefaults>
   <w:latentStyles w:count="276" w:defLockedState="0" w:defQFormat="0" w:defSemiHidden="0" w:defUIPriority="0" w:defUnhideWhenUsed="0"/>
   <w:style w:default="1" w:styleId="Normal" w:type="paragraph">
+    <w:pPr>
+      <w:spacing w:after="160" w:line="276" w:lineRule="auto"/>
+    </w:pPr>
     <w:name w:val="Normal"/>
     <w:qFormat/>
   </w:style>
@@ -2037,10 +2040,13 @@
     <w:link w:val="BodyTextChar"/>
     <w:qFormat/>
     <w:pPr>
-      <w:spacing w:after="180" w:before="180"/>
+      <w:spacing w:after="160" w:line="276" w:lineRule="auto"/>
     </w:pPr>
   </w:style>
   <w:style w:customStyle="1" w:styleId="FirstParagraph" w:type="paragraph">
+    <w:pPr>
+      <w:spacing w:after="160" w:line="276" w:lineRule="auto"/>
+    </w:pPr>
     <w:name w:val="First Paragraph"/>
     <w:basedOn w:val="BodyText"/>
     <w:next w:val="BodyText"/>
@@ -2051,7 +2057,7 @@
     <w:basedOn w:val="BodyText"/>
     <w:qFormat/>
     <w:pPr>
-      <w:spacing w:after="36" w:before="36"/>
+      <w:spacing w:after="80" w:line="264" w:lineRule="auto"/>
     </w:pPr>
   </w:style>
   <w:style w:styleId="Title" w:type="paragraph">
@@ -2063,14 +2069,15 @@
     <w:qFormat/>
     <w:rsid w:val="00A10FD9"/>
     <w:pPr>
-      <w:spacing w:after="80" w:line="240" w:lineRule="auto"/>
+      <w:spacing w:after="240"/>
       <w:contextualSpacing/>
       <w:jc w:val="center"/>
     </w:pPr>
     <w:rPr>
       <w:rFonts w:asciiTheme="majorHAnsi" w:cstheme="majorBidi" w:eastAsiaTheme="majorEastAsia" w:hAnsiTheme="majorHAnsi"/>
-      <w:sz w:val="56"/>
       <w:szCs w:val="56"/>
+      <w:sz w:val="22"/>
+      <w:szCs w:val="22"/>
     </w:rPr>
   </w:style>
   <w:style w:customStyle="1" w:styleId="TitleChar" w:type="character">
@@ -2196,9 +2203,10 @@
     <w:qFormat/>
     <w:rsid w:val="00A10FD9"/>
     <w:pPr>
+      <w:spacing w:after="200" w:before="480"/>
+      <w:keepNext/>
       <w:keepNext/>
       <w:keepLines/>
-      <w:spacing w:after="80" w:before="360"/>
       <w:outlineLvl w:val="0"/>
     </w:pPr>
     <w:rPr>
@@ -2219,9 +2227,10 @@
     <w:qFormat/>
     <w:rsid w:val="00A10FD9"/>
     <w:pPr>
+      <w:spacing w:after="160" w:before="420"/>
+      <w:keepNext/>
       <w:keepNext/>
       <w:keepLines/>
-      <w:spacing w:after="80" w:before="160"/>
       <w:outlineLvl w:val="1"/>
     </w:pPr>
     <w:rPr>
@@ -2242,9 +2251,10 @@
     <w:qFormat/>
     <w:rsid w:val="00A10FD9"/>
     <w:pPr>
+      <w:spacing w:after="120" w:before="320"/>
+      <w:keepNext/>
       <w:keepNext/>
       <w:keepLines/>
-      <w:spacing w:after="80" w:before="160"/>
       <w:outlineLvl w:val="2"/>
     </w:pPr>
     <w:rPr>
@@ -2588,7 +2598,7 @@
     <w:basedOn w:val="Normal"/>
     <w:link w:val="BodyTextChar"/>
     <w:pPr>
-      <w:spacing w:after="120" w:before="0"/>
+      <w:spacing w:after="320" w:before="60"/>
     </w:pPr>
     <w:rPr>
       <w:i/>
@@ -2598,14 +2608,22 @@
     <w:name w:val="Table Caption"/>
     <w:basedOn w:val="Caption"/>
     <w:pPr>
+      <w:spacing w:after="120" w:before="200"/>
       <w:keepNext/>
     </w:pPr>
   </w:style>
   <w:style w:customStyle="1" w:styleId="ImageCaption" w:type="paragraph">
+    <w:pPr>
+      <w:spacing w:after="320" w:before="60"/>
+    </w:pPr>
     <w:name w:val="Image Caption"/>
     <w:basedOn w:val="Caption"/>
   </w:style>
   <w:style w:customStyle="1" w:styleId="Figure" w:type="paragraph">
+    <w:pPr>
+      <w:spacing w:after="80" w:before="280"/>
+      <w:keepNext/>
+    </w:pPr>
     <w:name w:val="Figure"/>
     <w:basedOn w:val="Normal"/>
   </w:style>
@@ -2613,6 +2631,8 @@
     <w:name w:val="Captioned Figure"/>
     <w:basedOn w:val="Figure"/>
     <w:pPr>
+      <w:spacing w:after="80" w:before="280"/>
+      <w:keepNext/>
       <w:keepNext/>
     </w:pPr>
   </w:style>

</xml_diff>

<commit_message>
Digest readability: retune Word styles for list content, stamp image density
Two real causes behind the crowding. Pandoc styles every paragraph inside
a list as Compact, which is most of a digest, so tuning Normal alone did
nothing; Compact and the figure/caption styles now carry the house
spacing. And the 2x captures carried 96-dpi metadata, so a 544-pixel menu
was laid out 5.7 inches wide and filled a page; tools/digest_image_dpi.py
stamps 192 dpi and caps wide images to the 6.3-inch column. Values tabled
in docs/digests/README.md as a standing order.

Co-Authored-By: Claude Opus 5 <noreply@anthropic.com>
</commit_message>
<xml_diff>
--- a/docs/digests/2026-09-09.draft.docx
+++ b/docs/digests/2026-09-09.draft.docx
@@ -209,7 +209,7 @@
       <w:r>
         <w:drawing>
           <wp:inline>
-            <wp:extent cx="5181600" cy="6019800"/>
+            <wp:extent cx="2604364" cy="3025658"/>
             <wp:effectExtent b="0" l="0" r="0" t="0"/>
             <wp:docPr descr="The Insert menu: folio markers, the Tibetan and ACIP symbol palette, footnotes to the Draft, the date with the Tibetan year, and the Manuscript’s rich-text items." title="" id="10" name="Picture"/>
             <a:graphic>
@@ -230,7 +230,7 @@
                   <pic:spPr bwMode="auto">
                     <a:xfrm>
                       <a:off x="0" y="0"/>
-                      <a:ext cx="5181600" cy="6019800"/>
+                      <a:ext cx="2604364" cy="3025658"/>
                     </a:xfrm>
                     <a:prstGeom prst="rect">
                       <a:avLst/>
@@ -264,7 +264,7 @@
       <w:r>
         <w:drawing>
           <wp:inline>
-            <wp:extent cx="5334000" cy="5124507"/>
+            <wp:extent cx="3169281" cy="3044808"/>
             <wp:effectExtent b="0" l="0" r="0" t="0"/>
             <wp:docPr descr="The Tools menu: spelling doubts, phrase memory, hand-offs between panes, word count, document protection, templates, snippets and the new Compare submenu." title="" id="13" name="Picture"/>
             <a:graphic>
@@ -285,7 +285,7 @@
                   <pic:spPr bwMode="auto">
                     <a:xfrm>
                       <a:off x="0" y="0"/>
-                      <a:ext cx="5334000" cy="5124507"/>
+                      <a:ext cx="3169281" cy="3044808"/>
                     </a:xfrm>
                     <a:prstGeom prst="rect">
                       <a:avLst/>
@@ -2029,7 +2029,7 @@
   <w:latentStyles w:count="276" w:defLockedState="0" w:defQFormat="0" w:defSemiHidden="0" w:defUIPriority="0" w:defUnhideWhenUsed="0"/>
   <w:style w:default="1" w:styleId="Normal" w:type="paragraph">
     <w:pPr>
-      <w:spacing w:after="160" w:line="276" w:lineRule="auto"/>
+      <w:spacing w:after="200" w:line="288" w:lineRule="auto"/>
     </w:pPr>
     <w:name w:val="Normal"/>
     <w:qFormat/>
@@ -2040,12 +2040,12 @@
     <w:link w:val="BodyTextChar"/>
     <w:qFormat/>
     <w:pPr>
-      <w:spacing w:after="160" w:line="276" w:lineRule="auto"/>
+      <w:spacing w:after="200" w:line="288" w:lineRule="auto"/>
     </w:pPr>
   </w:style>
   <w:style w:customStyle="1" w:styleId="FirstParagraph" w:type="paragraph">
     <w:pPr>
-      <w:spacing w:after="160" w:line="276" w:lineRule="auto"/>
+      <w:spacing w:after="200" w:line="288" w:lineRule="auto"/>
     </w:pPr>
     <w:name w:val="First Paragraph"/>
     <w:basedOn w:val="BodyText"/>
@@ -2057,7 +2057,7 @@
     <w:basedOn w:val="BodyText"/>
     <w:qFormat/>
     <w:pPr>
-      <w:spacing w:after="80" w:line="264" w:lineRule="auto"/>
+      <w:spacing w:after="140" w:line="276" w:lineRule="auto"/>
     </w:pPr>
   </w:style>
   <w:style w:styleId="Title" w:type="paragraph">
@@ -2069,7 +2069,7 @@
     <w:qFormat/>
     <w:rsid w:val="00A10FD9"/>
     <w:pPr>
-      <w:spacing w:after="240"/>
+      <w:spacing w:after="320"/>
       <w:contextualSpacing/>
       <w:jc w:val="center"/>
     </w:pPr>
@@ -2203,7 +2203,7 @@
     <w:qFormat/>
     <w:rsid w:val="00A10FD9"/>
     <w:pPr>
-      <w:spacing w:after="200" w:before="480"/>
+      <w:spacing w:after="240" w:before="560"/>
       <w:keepNext/>
       <w:keepNext/>
       <w:keepLines/>
@@ -2227,7 +2227,7 @@
     <w:qFormat/>
     <w:rsid w:val="00A10FD9"/>
     <w:pPr>
-      <w:spacing w:after="160" w:before="420"/>
+      <w:spacing w:after="240" w:before="520"/>
       <w:keepNext/>
       <w:keepNext/>
       <w:keepLines/>
@@ -2251,7 +2251,7 @@
     <w:qFormat/>
     <w:rsid w:val="00A10FD9"/>
     <w:pPr>
-      <w:spacing w:after="120" w:before="320"/>
+      <w:spacing w:after="160" w:before="400"/>
       <w:keepNext/>
       <w:keepNext/>
       <w:keepLines/>
@@ -2523,7 +2523,7 @@
     <w:unhideWhenUsed/>
     <w:qFormat/>
     <w:pPr>
-      <w:spacing w:after="100" w:before="100"/>
+      <w:spacing w:after="160" w:before="160" w:line="276" w:lineRule="auto"/>
       <w:ind w:firstLine="0" w:left="480" w:right="480"/>
     </w:pPr>
   </w:style>
@@ -2598,7 +2598,7 @@
     <w:basedOn w:val="Normal"/>
     <w:link w:val="BodyTextChar"/>
     <w:pPr>
-      <w:spacing w:after="320" w:before="60"/>
+      <w:spacing w:after="480" w:before="120"/>
     </w:pPr>
     <w:rPr>
       <w:i/>
@@ -2608,20 +2608,21 @@
     <w:name w:val="Table Caption"/>
     <w:basedOn w:val="Caption"/>
     <w:pPr>
-      <w:spacing w:after="120" w:before="200"/>
+      <w:spacing w:after="140" w:before="240"/>
+      <w:keepNext/>
       <w:keepNext/>
     </w:pPr>
   </w:style>
   <w:style w:customStyle="1" w:styleId="ImageCaption" w:type="paragraph">
     <w:pPr>
-      <w:spacing w:after="320" w:before="60"/>
+      <w:spacing w:after="480" w:before="120"/>
     </w:pPr>
     <w:name w:val="Image Caption"/>
     <w:basedOn w:val="Caption"/>
   </w:style>
   <w:style w:customStyle="1" w:styleId="Figure" w:type="paragraph">
     <w:pPr>
-      <w:spacing w:after="80" w:before="280"/>
+      <w:spacing w:after="120" w:before="440"/>
       <w:keepNext/>
     </w:pPr>
     <w:name w:val="Figure"/>
@@ -2631,7 +2632,7 @@
     <w:name w:val="Captioned Figure"/>
     <w:basedOn w:val="Figure"/>
     <w:pPr>
-      <w:spacing w:after="80" w:before="280"/>
+      <w:spacing w:after="120" w:before="440"/>
       <w:keepNext/>
       <w:keepNext/>
     </w:pPr>

</xml_diff>

<commit_message>
Batch 4 captures for the digest: Versions and Apply Patch tables size to contents; the Apply Patch demo shows three hunks (two placed, one rejected); digest draft rebuilt with the suite captures, numbers and chart from the live batteries; LOG
Co-Authored-By: Claude Fable 5.1 <noreply@anthropic.com>
</commit_message>
<xml_diff>
--- a/docs/digests/2026-09-09.draft.docx
+++ b/docs/digests/2026-09-09.draft.docx
@@ -2,7 +2,7 @@
 <file path=word/document.xml><?xml version="1.0" encoding="utf-8"?>
 <w:document xmlns:w="http://schemas.openxmlformats.org/wordprocessingml/2006/main" xmlns:m="http://schemas.openxmlformats.org/officeDocument/2006/math" xmlns:r="http://schemas.openxmlformats.org/officeDocument/2006/relationships" xmlns:o="urn:schemas-microsoft-com:office:office" xmlns:v="urn:schemas-microsoft-com:vml" xmlns:w10="urn:schemas-microsoft-com:office:word" xmlns:a="http://schemas.openxmlformats.org/drawingml/2006/main" xmlns:pic="http://schemas.openxmlformats.org/drawingml/2006/picture" xmlns:wp="http://schemas.openxmlformats.org/drawingml/2006/wordprocessingDrawing">
   <w:body>
-    <w:bookmarkStart w:id="38" w:name="X310f4db6fd6320611d78350d6a7902b2cf3b9e1"/>
+    <w:bookmarkStart w:id="51" w:name="X310f4db6fd6320611d78350d6a7902b2cf3b9e1"/>
     <w:p>
       <w:pPr>
         <w:pStyle w:val="Heading1"/>
@@ -81,7 +81,7 @@
         <w:t xml:space="preserve">and line. Everything ran green on the full automated battery.</w:t>
       </w:r>
     </w:p>
-    <w:bookmarkStart w:id="30" w:name="what-i-did"/>
+    <w:bookmarkStart w:id="43" w:name="what-i-did"/>
     <w:p>
       <w:pPr>
         <w:pStyle w:val="Heading2"/>
@@ -264,7 +264,7 @@
       <w:r>
         <w:drawing>
           <wp:inline>
-            <wp:extent cx="3169281" cy="3044808"/>
+            <wp:extent cx="3169281" cy="3341629"/>
             <wp:effectExtent b="0" l="0" r="0" t="0"/>
             <wp:docPr descr="The Tools menu: spelling doubts, phrase memory, hand-offs between panes, word count, document protection, templates, snippets and the new Compare submenu." title="" id="13" name="Picture"/>
             <a:graphic>
@@ -285,7 +285,7 @@
                   <pic:spPr bwMode="auto">
                     <a:xfrm>
                       <a:off x="0" y="0"/>
-                      <a:ext cx="3169281" cy="3044808"/>
+                      <a:ext cx="3169281" cy="3341629"/>
                     </a:xfrm>
                     <a:prstGeom prst="rect">
                       <a:avLst/>
@@ -669,7 +669,7 @@
       <w:r>
         <w:drawing>
           <wp:inline>
-            <wp:extent cx="5334000" cy="2974873"/>
+            <wp:extent cx="5334000" cy="2978149"/>
             <wp:effectExtent b="0" l="0" r="0" t="0"/>
             <wp:docPr descr="Text Compare: two prints of the opening of the Diamond Cutter. The changed reading (THAMS CAD ↔ KUN) is marked at the syllable, a dropped line shows in red, an added line in green; the arrows between the panes copy a reading across; the map at the right edge shows every difference in the whole text." title="" id="22" name="Picture"/>
             <a:graphic>
@@ -690,7 +690,7 @@
                   <pic:spPr bwMode="auto">
                     <a:xfrm>
                       <a:off x="0" y="0"/>
-                      <a:ext cx="5334000" cy="2974873"/>
+                      <a:ext cx="5334000" cy="2978149"/>
                     </a:xfrm>
                     <a:prstGeom prst="rect">
                       <a:avLst/>
@@ -724,7 +724,7 @@
       <w:r>
         <w:drawing>
           <wp:inline>
-            <wp:extent cx="5334000" cy="2974873"/>
+            <wp:extent cx="5334000" cy="2978149"/>
             <wp:effectExtent b="0" l="0" r="0" t="0"/>
             <wp:docPr descr="Folder Compare: two batches classified Identical, Different, Left only and Right only, with Copy and Update actions that preview before copying and never delete." title="" id="25" name="Picture"/>
             <a:graphic>
@@ -745,7 +745,7 @@
                   <pic:spPr bwMode="auto">
                     <a:xfrm>
                       <a:off x="0" y="0"/>
-                      <a:ext cx="5334000" cy="2974873"/>
+                      <a:ext cx="5334000" cy="2978149"/>
                     </a:xfrm>
                     <a:prstGeom prst="rect">
                       <a:avLst/>
@@ -779,7 +779,7 @@
       <w:r>
         <w:drawing>
           <wp:inline>
-            <wp:extent cx="5334000" cy="2974873"/>
+            <wp:extent cx="5334000" cy="2978149"/>
             <wp:effectExtent b="0" l="0" r="0" t="0"/>
             <wp:docPr descr="Three-Way Merge: two proofreaders’ corrections of one text against the original. The change both agree on merged itself; the one they disagree on is listed as a conflict for a human to settle." title="" id="28" name="Picture"/>
             <a:graphic>
@@ -800,7 +800,7 @@
                   <pic:spPr bwMode="auto">
                     <a:xfrm>
                       <a:off x="0" y="0"/>
-                      <a:ext cx="5334000" cy="2974873"/>
+                      <a:ext cx="5334000" cy="2978149"/>
                     </a:xfrm>
                     <a:prstGeom prst="rect">
                       <a:avLst/>
@@ -1005,8 +1005,357 @@
         <w:t xml:space="preserve">verdict in packaging; a shutdown crash in a status-bar hook).</w:t>
       </w:r>
     </w:p>
-    <w:bookmarkEnd w:id="30"/>
-    <w:bookmarkStart w:id="31" w:name="decisions-i-made-along-the-way"/>
+    <w:bookmarkStart w:id="42" w:name="X7046d60f79bfb2303900403560402b0180cb2d6"/>
+    <w:p>
+      <w:pPr>
+        <w:pStyle w:val="Heading3"/>
+      </w:pPr>
+      <w:r>
+        <w:t xml:space="preserve">The analysis suite, batch 4 — the editing tools the compare engine made possible</w:t>
+      </w:r>
+    </w:p>
+    <w:p>
+      <w:pPr>
+        <w:pStyle w:val="FirstParagraph"/>
+      </w:pPr>
+      <w:r>
+        <w:t xml:space="preserve">With the compare engine in place I built the first batch of the analysis suite in the order the plan’s critic set, one feature at a time, each with its own test battery before I moved to the next.</w:t>
+      </w:r>
+    </w:p>
+    <w:p>
+      <w:pPr>
+        <w:pStyle w:val="BodyText"/>
+      </w:pPr>
+      <w:r>
+        <w:rPr>
+          <w:b/>
+          <w:bCs/>
+        </w:rPr>
+        <w:t xml:space="preserve">Versions.</w:t>
+      </w:r>
+      <w:r>
+        <w:t xml:space="preserve"> </w:t>
+      </w:r>
+      <w:r>
+        <w:t xml:space="preserve">Every save of a document, draft or manuscript now keeps a compressed copy with who saved it, when, in which encoding, the revision number and the text statistics of that moment. File ▸ Versions… lists them; a version can be compared with what I am editing or with another version, restored (the text on disk is kept first, even if another program changed it), named and pinned so it is never pruned, or asked which version first introduced a given line. Damaged records are shown red and excluded. Preferences ▸ Versions holds the switch, the caps and the rolling autosave slot. Renaming a file carries its history with it.</w:t>
+      </w:r>
+    </w:p>
+    <w:p>
+      <w:pPr>
+        <w:pStyle w:val="CaptionedFigure"/>
+      </w:pPr>
+      <w:r>
+        <w:drawing>
+          <wp:inline>
+            <wp:extent cx="5334000" cy="3350638"/>
+            <wp:effectExtent b="0" l="0" r="0" t="0"/>
+            <wp:docPr descr="Versions: three saves of one text, the middle one named and pinned. Compare with Current, Compare Two, Restore (two-step), Save Version As, Name, Line Origins." title="" id="31" name="Picture"/>
+            <a:graphic>
+              <a:graphicData uri="http://schemas.openxmlformats.org/drawingml/2006/picture">
+                <pic:pic>
+                  <pic:nvPicPr>
+                    <pic:cNvPr descr="img/2026-09-09/versions-window.png" id="32" name="Picture"/>
+                    <pic:cNvPicPr>
+                      <a:picLocks noChangeArrowheads="1" noChangeAspect="1"/>
+                    </pic:cNvPicPr>
+                  </pic:nvPicPr>
+                  <pic:blipFill>
+                    <a:blip r:embed="rId30"/>
+                    <a:stretch>
+                      <a:fillRect/>
+                    </a:stretch>
+                  </pic:blipFill>
+                  <pic:spPr bwMode="auto">
+                    <a:xfrm>
+                      <a:off x="0" y="0"/>
+                      <a:ext cx="5334000" cy="3350638"/>
+                    </a:xfrm>
+                    <a:prstGeom prst="rect">
+                      <a:avLst/>
+                    </a:prstGeom>
+                    <a:noFill/>
+                    <a:ln w="9525">
+                      <a:noFill/>
+                      <a:headEnd/>
+                      <a:tailEnd/>
+                    </a:ln>
+                  </pic:spPr>
+                </pic:pic>
+              </a:graphicData>
+            </a:graphic>
+          </wp:inline>
+        </w:drawing>
+      </w:r>
+    </w:p>
+    <w:p>
+      <w:pPr>
+        <w:pStyle w:val="ImageCaption"/>
+      </w:pPr>
+      <w:r>
+        <w:t xml:space="preserve">Versions: three saves of one text, the middle one named and pinned. Compare with Current, Compare Two, Restore (two-step), Save Version As, Name, Line Origins.</w:t>
+      </w:r>
+    </w:p>
+    <w:p>
+      <w:pPr>
+        <w:pStyle w:val="BodyText"/>
+      </w:pPr>
+      <w:r>
+        <w:rPr>
+          <w:b/>
+          <w:bCs/>
+        </w:rPr>
+        <w:t xml:space="preserve">Changed-folios report.</w:t>
+      </w:r>
+      <w:r>
+        <w:t xml:space="preserve"> </w:t>
+      </w:r>
+      <w:r>
+        <w:t xml:space="preserve">“7 of 143 folios changed”</w:t>
+      </w:r>
+      <w:r>
+        <w:t xml:space="preserve">: the apparatus grouped by the left text’s folio markers, as a Markdown table with the readings under each folio, or as CSV. It is a Save Report filter, a Copy Changed Folios action, a fragment on the Compare status line, and a command-line output. The header states every grouping rule, so a reader can reproduce it.</w:t>
+      </w:r>
+    </w:p>
+    <w:p>
+      <w:pPr>
+        <w:pStyle w:val="BodyText"/>
+      </w:pPr>
+      <w:r>
+        <w:rPr>
+          <w:b/>
+          <w:bCs/>
+        </w:rPr>
+        <w:t xml:space="preserve">Normalize.</w:t>
+      </w:r>
+      <w:r>
+        <w:t xml:space="preserve"> </w:t>
+      </w:r>
+      <w:r>
+        <w:t xml:space="preserve">The compare rules offered as transformations: collapse spacing, trailing blanks, blank-line runs, the double-shad spelling, spacing around the shad, apparatus spans, folio markers, line endings, a final line break, house-style spacing. Every run previews as a diff in the Compare pane, lists the lines the rules refused and why, and only then applies — the Apply button is dead until a preview exists for exactly these settings and this text. The double-shad form has no default: that is the house’s ruling to make, not mine.</w:t>
+      </w:r>
+    </w:p>
+    <w:p>
+      <w:pPr>
+        <w:pStyle w:val="CaptionedFigure"/>
+      </w:pPr>
+      <w:r>
+        <w:drawing>
+          <wp:inline>
+            <wp:extent cx="5334000" cy="4734757"/>
+            <wp:effectExtent b="0" l="0" r="0" t="0"/>
+            <wp:docPr descr="Normalize: the rules as switches, the lossy ones in red, the preview counted from the diff, the refused lines listed." title="" id="34" name="Picture"/>
+            <a:graphic>
+              <a:graphicData uri="http://schemas.openxmlformats.org/drawingml/2006/picture">
+                <pic:pic>
+                  <pic:nvPicPr>
+                    <pic:cNvPr descr="img/2026-09-09/normalize-dialog.png" id="35" name="Picture"/>
+                    <pic:cNvPicPr>
+                      <a:picLocks noChangeArrowheads="1" noChangeAspect="1"/>
+                    </pic:cNvPicPr>
+                  </pic:nvPicPr>
+                  <pic:blipFill>
+                    <a:blip r:embed="rId33"/>
+                    <a:stretch>
+                      <a:fillRect/>
+                    </a:stretch>
+                  </pic:blipFill>
+                  <pic:spPr bwMode="auto">
+                    <a:xfrm>
+                      <a:off x="0" y="0"/>
+                      <a:ext cx="5334000" cy="4734757"/>
+                    </a:xfrm>
+                    <a:prstGeom prst="rect">
+                      <a:avLst/>
+                    </a:prstGeom>
+                    <a:noFill/>
+                    <a:ln w="9525">
+                      <a:noFill/>
+                      <a:headEnd/>
+                      <a:tailEnd/>
+                    </a:ln>
+                  </pic:spPr>
+                </pic:pic>
+              </a:graphicData>
+            </a:graphic>
+          </wp:inline>
+        </w:drawing>
+      </w:r>
+    </w:p>
+    <w:p>
+      <w:pPr>
+        <w:pStyle w:val="ImageCaption"/>
+      </w:pPr>
+      <w:r>
+        <w:t xml:space="preserve">Normalize: the rules as switches, the lossy ones in red, the preview counted from the diff, the refused lines listed.</w:t>
+      </w:r>
+    </w:p>
+    <w:p>
+      <w:pPr>
+        <w:pStyle w:val="BodyText"/>
+      </w:pPr>
+      <w:r>
+        <w:rPr>
+          <w:b/>
+          <w:bCs/>
+        </w:rPr>
+        <w:t xml:space="preserve">Replace in Files.</w:t>
+      </w:r>
+      <w:r>
+        <w:t xml:space="preserve"> </w:t>
+      </w:r>
+      <w:r>
+        <w:t xml:space="preserve">One systematic fix across a whole folder, every occurrence listed with its line before and after, tick or untick, then a two-step apply to the ticked files only. Every skipped file is named with its reason (binary, not UTF-8, over the size cap, past the file cap, open with unsaved edits, changed since the preview, a library text without permission). A search text in the wrong script gets a notice, so a count of zero never reads as a clean bill of health. Each run leaves a changeset record and an undo that restores the files from their pre-replace versions and skips any file edited since. Counts come from the files themselves, never from the search index — the footer says so.</w:t>
+      </w:r>
+    </w:p>
+    <w:p>
+      <w:pPr>
+        <w:pStyle w:val="CaptionedFigure"/>
+      </w:pPr>
+      <w:r>
+        <w:drawing>
+          <wp:inline>
+            <wp:extent cx="5334000" cy="4718538"/>
+            <wp:effectExtent b="0" l="0" r="0" t="0"/>
+            <wp:docPr descr="Replace in Files: three occurrences in two files of a small batch, one file expanded to its lines, the honest footer beneath." title="" id="37" name="Picture"/>
+            <a:graphic>
+              <a:graphicData uri="http://schemas.openxmlformats.org/drawingml/2006/picture">
+                <pic:pic>
+                  <pic:nvPicPr>
+                    <pic:cNvPr descr="img/2026-09-09/replace-in-files.png" id="38" name="Picture"/>
+                    <pic:cNvPicPr>
+                      <a:picLocks noChangeArrowheads="1" noChangeAspect="1"/>
+                    </pic:cNvPicPr>
+                  </pic:nvPicPr>
+                  <pic:blipFill>
+                    <a:blip r:embed="rId36"/>
+                    <a:stretch>
+                      <a:fillRect/>
+                    </a:stretch>
+                  </pic:blipFill>
+                  <pic:spPr bwMode="auto">
+                    <a:xfrm>
+                      <a:off x="0" y="0"/>
+                      <a:ext cx="5334000" cy="4718538"/>
+                    </a:xfrm>
+                    <a:prstGeom prst="rect">
+                      <a:avLst/>
+                    </a:prstGeom>
+                    <a:noFill/>
+                    <a:ln w="9525">
+                      <a:noFill/>
+                      <a:headEnd/>
+                      <a:tailEnd/>
+                    </a:ln>
+                  </pic:spPr>
+                </pic:pic>
+              </a:graphicData>
+            </a:graphic>
+          </wp:inline>
+        </w:drawing>
+      </w:r>
+    </w:p>
+    <w:p>
+      <w:pPr>
+        <w:pStyle w:val="ImageCaption"/>
+      </w:pPr>
+      <w:r>
+        <w:t xml:space="preserve">Replace in Files: three occurrences in two files of a small batch, one file expanded to its lines, the honest footer beneath.</w:t>
+      </w:r>
+    </w:p>
+    <w:p>
+      <w:pPr>
+        <w:pStyle w:val="BodyText"/>
+      </w:pPr>
+      <w:r>
+        <w:rPr>
+          <w:b/>
+          <w:bCs/>
+        </w:rPr>
+        <w:t xml:space="preserve">Apply Patch</w:t>
+      </w:r>
+      <w:r>
+        <w:t xml:space="preserve"> </w:t>
+      </w:r>
+      <w:r>
+        <w:t xml:space="preserve">(in progress at the time of this draft). A corrector’s unified diff loaded against my copy: each hunk placed exactly, with an offset, with loosened context, already applied, or rejected — five distinct verdicts, never folded into one. The result is a diff in the Compare pane, the rejected hunks go to a .rej file for the corrector, and the previous text is kept as a version before anything is written.</w:t>
+      </w:r>
+    </w:p>
+    <w:p>
+      <w:pPr>
+        <w:pStyle w:val="CaptionedFigure"/>
+      </w:pPr>
+      <w:r>
+        <w:drawing>
+          <wp:inline>
+            <wp:extent cx="5334000" cy="3674533"/>
+            <wp:effectExtent b="0" l="0" r="0" t="0"/>
+            <wp:docPr descr="Apply Patch: a corrector’s diff with three hunks against a copy where one line was retyped — two placed exactly, one rejected and named, nothing written until Apply." title="" id="40" name="Picture"/>
+            <a:graphic>
+              <a:graphicData uri="http://schemas.openxmlformats.org/drawingml/2006/picture">
+                <pic:pic>
+                  <pic:nvPicPr>
+                    <pic:cNvPr descr="img/2026-09-09/apply-patch.png" id="41" name="Picture"/>
+                    <pic:cNvPicPr>
+                      <a:picLocks noChangeArrowheads="1" noChangeAspect="1"/>
+                    </pic:cNvPicPr>
+                  </pic:nvPicPr>
+                  <pic:blipFill>
+                    <a:blip r:embed="rId39"/>
+                    <a:stretch>
+                      <a:fillRect/>
+                    </a:stretch>
+                  </pic:blipFill>
+                  <pic:spPr bwMode="auto">
+                    <a:xfrm>
+                      <a:off x="0" y="0"/>
+                      <a:ext cx="5334000" cy="3674533"/>
+                    </a:xfrm>
+                    <a:prstGeom prst="rect">
+                      <a:avLst/>
+                    </a:prstGeom>
+                    <a:noFill/>
+                    <a:ln w="9525">
+                      <a:noFill/>
+                      <a:headEnd/>
+                      <a:tailEnd/>
+                    </a:ln>
+                  </pic:spPr>
+                </pic:pic>
+              </a:graphicData>
+            </a:graphic>
+          </wp:inline>
+        </w:drawing>
+      </w:r>
+    </w:p>
+    <w:p>
+      <w:pPr>
+        <w:pStyle w:val="ImageCaption"/>
+      </w:pPr>
+      <w:r>
+        <w:t xml:space="preserve">Apply Patch: a corrector’s diff with three hunks against a copy where one line was retyped — two placed exactly, one rejected and named, nothing written until Apply.</w:t>
+      </w:r>
+    </w:p>
+    <w:p>
+      <w:pPr>
+        <w:pStyle w:val="BodyText"/>
+      </w:pPr>
+      <w:r>
+        <w:rPr>
+          <w:b/>
+          <w:bCs/>
+        </w:rPr>
+        <w:t xml:space="preserve">Tracked changes for Word</w:t>
+      </w:r>
+      <w:r>
+        <w:t xml:space="preserve"> </w:t>
+      </w:r>
+      <w:r>
+        <w:t xml:space="preserve">(engine in progress). The differences between two drafts written as a Word document with real revision marks, so Geshe Michael can accept or reject each change in Word itself. The first paragraph says what the file compares, under what rules, who ran it, and that the marks are machine-computed. I will not add it to the Save Report menu until I have opened a sample in Word and recorded that Accept All gives text B and Reject All gives text A.</w:t>
+      </w:r>
+    </w:p>
+    <w:bookmarkEnd w:id="42"/>
+    <w:bookmarkEnd w:id="43"/>
+    <w:bookmarkStart w:id="44" w:name="decisions-i-made-along-the-way"/>
     <w:p>
       <w:pPr>
         <w:pStyle w:val="Heading2"/>
@@ -1154,8 +1503,131 @@
         <w:t xml:space="preserve">questions to put to Geshe Michael.</w:t>
       </w:r>
     </w:p>
-    <w:bookmarkEnd w:id="31"/>
-    <w:bookmarkStart w:id="35" w:name="numbers"/>
+    <w:p>
+      <w:pPr>
+        <w:pStyle w:val="Compact"/>
+        <w:numPr>
+          <w:ilvl w:val="0"/>
+          <w:numId w:val="1006"/>
+        </w:numPr>
+      </w:pPr>
+      <w:r>
+        <w:t xml:space="preserve">Versions are deduplicated by content: saving an unchanged text keeps</w:t>
+      </w:r>
+      <w:r>
+        <w:t xml:space="preserve"> </w:t>
+      </w:r>
+      <w:r>
+        <w:t xml:space="preserve">nothing new and says so, and restoring a version does not re-bank a</w:t>
+      </w:r>
+      <w:r>
+        <w:t xml:space="preserve"> </w:t>
+      </w:r>
+      <w:r>
+        <w:t xml:space="preserve">copy that is already kept. Identical bytes are one version.</w:t>
+      </w:r>
+    </w:p>
+    <w:p>
+      <w:pPr>
+        <w:pStyle w:val="Compact"/>
+        <w:numPr>
+          <w:ilvl w:val="0"/>
+          <w:numId w:val="1006"/>
+        </w:numPr>
+      </w:pPr>
+      <w:r>
+        <w:t xml:space="preserve">The double-shad spelling and the space before a shad have no default in</w:t>
+      </w:r>
+      <w:r>
+        <w:t xml:space="preserve"> </w:t>
+      </w:r>
+      <w:r>
+        <w:t xml:space="preserve">Normalize. Shipping a wrong default would silently re-spell every shad</w:t>
+      </w:r>
+      <w:r>
+        <w:t xml:space="preserve"> </w:t>
+      </w:r>
+      <w:r>
+        <w:t xml:space="preserve">in a volume; the house ruling decides.</w:t>
+      </w:r>
+    </w:p>
+    <w:p>
+      <w:pPr>
+        <w:pStyle w:val="Compact"/>
+        <w:numPr>
+          <w:ilvl w:val="0"/>
+          <w:numId w:val="1006"/>
+        </w:numPr>
+      </w:pPr>
+      <w:r>
+        <w:t xml:space="preserve">Replace in Files refuses to run when Versions are switched off: without</w:t>
+      </w:r>
+      <w:r>
+        <w:t xml:space="preserve"> </w:t>
+      </w:r>
+      <w:r>
+        <w:t xml:space="preserve">the pre-replace copies there would be no undo, and a batch rewrite</w:t>
+      </w:r>
+      <w:r>
+        <w:t xml:space="preserve"> </w:t>
+      </w:r>
+      <w:r>
+        <w:t xml:space="preserve">without an undo is not something I will offer.</w:t>
+      </w:r>
+    </w:p>
+    <w:p>
+      <w:pPr>
+        <w:pStyle w:val="Compact"/>
+        <w:numPr>
+          <w:ilvl w:val="0"/>
+          <w:numId w:val="1006"/>
+        </w:numPr>
+      </w:pPr>
+      <w:r>
+        <w:t xml:space="preserve">A search text in one script against files in another gets a notice</w:t>
+      </w:r>
+      <w:r>
+        <w:t xml:space="preserve"> </w:t>
+      </w:r>
+      <w:r>
+        <w:t xml:space="preserve">instead of a zero. A zero must never read as</w:t>
+      </w:r>
+      <w:r>
+        <w:t xml:space="preserve"> </w:t>
+      </w:r>
+      <w:r>
+        <w:t xml:space="preserve">“the text is clean”</w:t>
+      </w:r>
+      <w:r>
+        <w:t xml:space="preserve">.</w:t>
+      </w:r>
+    </w:p>
+    <w:p>
+      <w:pPr>
+        <w:pStyle w:val="Compact"/>
+        <w:numPr>
+          <w:ilvl w:val="0"/>
+          <w:numId w:val="1006"/>
+        </w:numPr>
+      </w:pPr>
+      <w:r>
+        <w:t xml:space="preserve">The Word redline ships command-line first. The menu filter appears only</w:t>
+      </w:r>
+      <w:r>
+        <w:t xml:space="preserve"> </w:t>
+      </w:r>
+      <w:r>
+        <w:t xml:space="preserve">after I have opened a sample in Word and recorded that Accept All gives</w:t>
+      </w:r>
+      <w:r>
+        <w:t xml:space="preserve"> </w:t>
+      </w:r>
+      <w:r>
+        <w:t xml:space="preserve">text B and Reject All gives text A. No dead control in the meantime.</w:t>
+      </w:r>
+    </w:p>
+    <w:bookmarkEnd w:id="44"/>
+    <w:bookmarkStart w:id="48" w:name="numbers"/>
     <w:p>
       <w:pPr>
         <w:pStyle w:val="Heading2"/>
@@ -1173,18 +1645,18 @@
           <wp:inline>
             <wp:extent cx="5334000" cy="2301240"/>
             <wp:effectExtent b="0" l="0" r="0" t="0"/>
-            <wp:docPr descr="Before and after, Monday 13:30 to now. Every count comes from the build itself: menus and pages from the running app, suites from the test runner." title="" id="33" name="Picture"/>
+            <wp:docPr descr="Before and after, Monday 13:30 to now. Every count comes from the build itself: menus and pages from the running app, suites and checks from the test runner." title="" id="46" name="Picture"/>
             <a:graphic>
               <a:graphicData uri="http://schemas.openxmlformats.org/drawingml/2006/picture">
                 <pic:pic>
                   <pic:nvPicPr>
-                    <pic:cNvPr descr="img/2026-09-09/chart-numbers.png" id="34" name="Picture"/>
+                    <pic:cNvPr descr="img/2026-09-09/chart-numbers.png" id="47" name="Picture"/>
                     <pic:cNvPicPr>
                       <a:picLocks noChangeArrowheads="1" noChangeAspect="1"/>
                     </pic:cNvPicPr>
                   </pic:nvPicPr>
                   <pic:blipFill>
-                    <a:blip r:embed="rId32"/>
+                    <a:blip r:embed="rId45"/>
                     <a:stretch>
                       <a:fillRect/>
                     </a:stretch>
@@ -1216,13 +1688,14 @@
         <w:pStyle w:val="ImageCaption"/>
       </w:pPr>
       <w:r>
-        <w:t xml:space="preserve">Before and after, Monday 13:30 to now. Every count comes from the build itself: menus and pages from the running app, suites from the test runner.</w:t>
+        <w:t xml:space="preserve">Before and after, Monday 13:30 to now. Every count comes from the build itself: menus and pages from the running app, suites and checks from the test runner.</w:t>
       </w:r>
     </w:p>
     <w:tbl>
       <w:tblPr>
         <w:tblStyle w:val="Table"/>
-        <w:tblW w:type="auto" w:w="0"/>
+        <w:tblW w:type="pct" w:w="5000"/>
+        <w:tblLayout w:type="fixed"/>
         <w:tblLook w:firstRow="1" w:lastRow="0" w:firstColumn="0" w:lastColumn="0" w:noHBand="0" w:noVBand="0" w:val="0020"/>
       </w:tblPr>
       <w:tblGrid>
@@ -1330,7 +1803,7 @@
               <w:pStyle w:val="Compact"/>
             </w:pPr>
             <w:r>
-              <w:t xml:space="preserve">11 pages</w:t>
+              <w:t xml:space="preserve">12 pages</w:t>
             </w:r>
           </w:p>
         </w:tc>
@@ -1400,7 +1873,7 @@
               <w:pStyle w:val="Compact"/>
             </w:pPr>
             <w:r>
-              <w:t xml:space="preserve">102, all green</w:t>
+              <w:t xml:space="preserve">108, all green</w:t>
             </w:r>
           </w:p>
         </w:tc>
@@ -1413,7 +1886,7 @@
               <w:pStyle w:val="Compact"/>
             </w:pPr>
             <w:r>
-              <w:t xml:space="preserve">Compare engine battery</w:t>
+              <w:t xml:space="preserve">Core text-engine batteries (compare, versions, normalize, patch, Word redline, zip, file walk)</w:t>
             </w:r>
           </w:p>
         </w:tc>
@@ -1435,7 +1908,7 @@
               <w:pStyle w:val="Compact"/>
             </w:pPr>
             <w:r>
-              <w:t xml:space="preserve">43 checks</w:t>
+              <w:t xml:space="preserve">214 checks in 7 batteries</w:t>
             </w:r>
           </w:p>
         </w:tc>
@@ -1448,7 +1921,7 @@
               <w:pStyle w:val="Compact"/>
             </w:pPr>
             <w:r>
-              <w:t xml:space="preserve">New self-test checks since Monday’s digest</w:t>
+              <w:t xml:space="preserve">App self-test checks</w:t>
             </w:r>
           </w:p>
         </w:tc>
@@ -1470,7 +1943,42 @@
               <w:pStyle w:val="Compact"/>
             </w:pPr>
             <w:r>
-              <w:t xml:space="preserve">150+</w:t>
+              <w:t xml:space="preserve">670</w:t>
+            </w:r>
+          </w:p>
+        </w:tc>
+      </w:tr>
+      <w:tr>
+        <w:tc>
+          <w:tcPr/>
+          <w:p>
+            <w:pPr>
+              <w:pStyle w:val="Compact"/>
+            </w:pPr>
+            <w:r>
+              <w:t xml:space="preserve">Analysis-suite features shipped</w:t>
+            </w:r>
+          </w:p>
+        </w:tc>
+        <w:tc>
+          <w:tcPr/>
+          <w:p>
+            <w:pPr>
+              <w:pStyle w:val="Compact"/>
+            </w:pPr>
+            <w:r>
+              <w:t xml:space="preserve">0</w:t>
+            </w:r>
+          </w:p>
+        </w:tc>
+        <w:tc>
+          <w:tcPr/>
+          <w:p>
+            <w:pPr>
+              <w:pStyle w:val="Compact"/>
+            </w:pPr>
+            <w:r>
+              <w:t xml:space="preserve">6 of batch 4 (all)</w:t>
             </w:r>
           </w:p>
         </w:tc>
@@ -1511,8 +2019,8 @@
         </w:tc>
       </w:tr>
     </w:tbl>
-    <w:bookmarkEnd w:id="35"/>
-    <w:bookmarkStart w:id="36" w:name="open-questions-for-leadership"/>
+    <w:bookmarkEnd w:id="48"/>
+    <w:bookmarkStart w:id="49" w:name="open-questions-for-leadership"/>
     <w:p>
       <w:pPr>
         <w:pStyle w:val="Heading2"/>
@@ -1625,8 +2133,161 @@
         <w:t xml:space="preserve">before it is designed in detail.</w:t>
       </w:r>
     </w:p>
-    <w:bookmarkEnd w:id="36"/>
-    <w:bookmarkStart w:id="37" w:name="next"/>
+    <w:p>
+      <w:pPr>
+        <w:pStyle w:val="Compact"/>
+        <w:numPr>
+          <w:ilvl w:val="0"/>
+          <w:numId w:val="1007"/>
+        </w:numPr>
+      </w:pPr>
+      <w:r>
+        <w:rPr>
+          <w:b/>
+          <w:bCs/>
+        </w:rPr>
+        <w:t xml:space="preserve">New:</w:t>
+      </w:r>
+      <w:r>
+        <w:t xml:space="preserve"> </w:t>
+      </w:r>
+      <w:r>
+        <w:t xml:space="preserve">the house convention for the double shad (</w:t>
+      </w:r>
+      <w:r>
+        <w:rPr>
+          <w:rStyle w:val="VerbatimChar"/>
+        </w:rPr>
+        <w:t xml:space="preserve">,,</w:t>
+      </w:r>
+      <w:r>
+        <w:t xml:space="preserve"> </w:t>
+      </w:r>
+      <w:r>
+        <w:t xml:space="preserve">or</w:t>
+      </w:r>
+      <w:r>
+        <w:t xml:space="preserve"> </w:t>
+      </w:r>
+      <w:r>
+        <w:rPr>
+          <w:rStyle w:val="VerbatimChar"/>
+        </w:rPr>
+        <w:t xml:space="preserve">, ,</w:t>
+      </w:r>
+      <w:r>
+        <w:t xml:space="preserve"> </w:t>
+      </w:r>
+      <w:r>
+        <w:t xml:space="preserve">in</w:t>
+      </w:r>
+      <w:r>
+        <w:t xml:space="preserve"> </w:t>
+      </w:r>
+      <w:r>
+        <w:t xml:space="preserve">ACIP;</w:t>
+      </w:r>
+      <w:r>
+        <w:t xml:space="preserve"> </w:t>
+      </w:r>
+      <w:r>
+        <w:rPr>
+          <w:rStyle w:val="VerbatimChar"/>
+        </w:rPr>
+        <w:t xml:space="preserve">།།</w:t>
+      </w:r>
+      <w:r>
+        <w:t xml:space="preserve"> </w:t>
+      </w:r>
+      <w:r>
+        <w:t xml:space="preserve">or</w:t>
+      </w:r>
+      <w:r>
+        <w:t xml:space="preserve"> </w:t>
+      </w:r>
+      <w:r>
+        <w:rPr>
+          <w:rStyle w:val="VerbatimChar"/>
+        </w:rPr>
+        <w:t xml:space="preserve">༎</w:t>
+      </w:r>
+      <w:r>
+        <w:t xml:space="preserve"> </w:t>
+      </w:r>
+      <w:r>
+        <w:t xml:space="preserve">in Tibetan script) and the space before a shad — until</w:t>
+      </w:r>
+      <w:r>
+        <w:t xml:space="preserve"> </w:t>
+      </w:r>
+      <w:r>
+        <w:t xml:space="preserve">ruled, Normalize leaves both alone.</w:t>
+      </w:r>
+    </w:p>
+    <w:p>
+      <w:pPr>
+        <w:pStyle w:val="Compact"/>
+        <w:numPr>
+          <w:ilvl w:val="0"/>
+          <w:numId w:val="1007"/>
+        </w:numPr>
+      </w:pPr>
+      <w:r>
+        <w:rPr>
+          <w:b/>
+          <w:bCs/>
+        </w:rPr>
+        <w:t xml:space="preserve">New:</w:t>
+      </w:r>
+      <w:r>
+        <w:t xml:space="preserve"> </w:t>
+      </w:r>
+      <w:r>
+        <w:t xml:space="preserve">whether canonical library texts may be rewritten in bulk by</w:t>
+      </w:r>
+      <w:r>
+        <w:t xml:space="preserve"> </w:t>
+      </w:r>
+      <w:r>
+        <w:t xml:space="preserve">Replace in Files (today: only with an explicit switch, and every such</w:t>
+      </w:r>
+      <w:r>
+        <w:t xml:space="preserve"> </w:t>
+      </w:r>
+      <w:r>
+        <w:t xml:space="preserve">file is badged and counted).</w:t>
+      </w:r>
+    </w:p>
+    <w:p>
+      <w:pPr>
+        <w:pStyle w:val="Compact"/>
+        <w:numPr>
+          <w:ilvl w:val="0"/>
+          <w:numId w:val="1007"/>
+        </w:numPr>
+      </w:pPr>
+      <w:r>
+        <w:rPr>
+          <w:b/>
+          <w:bCs/>
+        </w:rPr>
+        <w:t xml:space="preserve">New:</w:t>
+      </w:r>
+      <w:r>
+        <w:t xml:space="preserve"> </w:t>
+      </w:r>
+      <w:r>
+        <w:t xml:space="preserve">a Word verification of the tracked-changes export — ten minutes</w:t>
+      </w:r>
+      <w:r>
+        <w:t xml:space="preserve"> </w:t>
+      </w:r>
+      <w:r>
+        <w:t xml:space="preserve">with a sample in Microsoft Word — before it appears in the menus.</w:t>
+      </w:r>
+    </w:p>
+    <w:bookmarkEnd w:id="49"/>
+    <w:bookmarkStart w:id="50" w:name="next"/>
     <w:p>
       <w:pPr>
         <w:pStyle w:val="Heading2"/>
@@ -1640,23 +2301,35 @@
         <w:pStyle w:val="FirstParagraph"/>
       </w:pPr>
       <w:r>
-        <w:t xml:space="preserve">Press a fresh build; resume the pane-by-pane audit at the Overlay’s</w:t>
-      </w:r>
-      <w:r>
-        <w:t xml:space="preserve"> </w:t>
-      </w:r>
-      <w:r>
-        <w:t xml:space="preserve">Document box; begin the first follow-on compare batch (document Versions,</w:t>
-      </w:r>
-      <w:r>
-        <w:t xml:space="preserve"> </w:t>
-      </w:r>
-      <w:r>
-        <w:t xml:space="preserve">Replace in Files with preview, Apply Patch); finish the Map pane study.</w:t>
-      </w:r>
-    </w:p>
-    <w:bookmarkEnd w:id="37"/>
-    <w:bookmarkEnd w:id="38"/>
+        <w:t xml:space="preserve">Finish Apply Patch and the Word redline (engines under test); press a</w:t>
+      </w:r>
+      <w:r>
+        <w:t xml:space="preserve"> </w:t>
+      </w:r>
+      <w:r>
+        <w:t xml:space="preserve">fresh build with the whole batch and relaunch it on the desktop; clear the</w:t>
+      </w:r>
+      <w:r>
+        <w:t xml:space="preserve"> </w:t>
+      </w:r>
+      <w:r>
+        <w:t xml:space="preserve">twelve release-audit items that still need a ruling; then the Map pane</w:t>
+      </w:r>
+      <w:r>
+        <w:t xml:space="preserve"> </w:t>
+      </w:r>
+      <w:r>
+        <w:t xml:space="preserve">study and the second analysis batch (repeated passages, collation of many</w:t>
+      </w:r>
+      <w:r>
+        <w:t xml:space="preserve"> </w:t>
+      </w:r>
+      <w:r>
+        <w:t xml:space="preserve">witnesses, the citation and reference bank).</w:t>
+      </w:r>
+    </w:p>
+    <w:bookmarkEnd w:id="50"/>
+    <w:bookmarkEnd w:id="51"/>
     <w:sectPr>
       <w:footnotePr>
         <w:numRestart w:val="eachSect"/>

</xml_diff>

<commit_message>
Digest draft: audit sweep and press sections, 109 suites in the chart; LOG: final press of the batch
Co-Authored-By: Claude Fable 5.1 <noreply@anthropic.com>
</commit_message>
<xml_diff>
--- a/docs/digests/2026-09-09.draft.docx
+++ b/docs/digests/2026-09-09.draft.docx
@@ -2,7 +2,7 @@
 <file path=word/document.xml><?xml version="1.0" encoding="utf-8"?>
 <w:document xmlns:w="http://schemas.openxmlformats.org/wordprocessingml/2006/main" xmlns:m="http://schemas.openxmlformats.org/officeDocument/2006/math" xmlns:r="http://schemas.openxmlformats.org/officeDocument/2006/relationships" xmlns:o="urn:schemas-microsoft-com:office:office" xmlns:v="urn:schemas-microsoft-com:vml" xmlns:w10="urn:schemas-microsoft-com:office:word" xmlns:a="http://schemas.openxmlformats.org/drawingml/2006/main" xmlns:pic="http://schemas.openxmlformats.org/drawingml/2006/picture" xmlns:wp="http://schemas.openxmlformats.org/drawingml/2006/wordprocessingDrawing">
   <w:body>
-    <w:bookmarkStart w:id="51" w:name="X310f4db6fd6320611d78350d6a7902b2cf3b9e1"/>
+    <w:bookmarkStart w:id="53" w:name="X310f4db6fd6320611d78350d6a7902b2cf3b9e1"/>
     <w:p>
       <w:pPr>
         <w:pStyle w:val="Heading1"/>
@@ -81,7 +81,7 @@
         <w:t xml:space="preserve">and line. Everything ran green on the full automated battery.</w:t>
       </w:r>
     </w:p>
-    <w:bookmarkStart w:id="43" w:name="what-i-did"/>
+    <w:bookmarkStart w:id="45" w:name="what-i-did"/>
     <w:p>
       <w:pPr>
         <w:pStyle w:val="Heading2"/>
@@ -1354,8 +1354,56 @@
       </w:r>
     </w:p>
     <w:bookmarkEnd w:id="42"/>
+    <w:bookmarkStart w:id="43" w:name="X7dffe74ca0dee34354387a17c7d10998b3af865"/>
+    <w:p>
+      <w:pPr>
+        <w:pStyle w:val="Heading3"/>
+      </w:pPr>
+      <w:r>
+        <w:t xml:space="preserve">Release audit: eleven of twelve open items closed</w:t>
+      </w:r>
+    </w:p>
+    <w:p>
+      <w:pPr>
+        <w:pStyle w:val="FirstParagraph"/>
+      </w:pPr>
+      <w:r>
+        <w:t xml:space="preserve">The pane-by-pane release audit had left twelve items on the main window needing a ruling. I closed eleven today: the one headless probe that ran outside the safety guard now runs inside it; a dead window-size call is gone; the Sanskrit glyph check, which used to run only by hand, is a test gate (109 suites now); a Quick Access pin whose command was renamed shows as</w:t>
+      </w:r>
+      <w:r>
+        <w:t xml:space="preserve"> </w:t>
+      </w:r>
+      <w:r>
+        <w:t xml:space="preserve">“not in this build”</w:t>
+      </w:r>
+      <w:r>
+        <w:t xml:space="preserve"> </w:t>
+      </w:r>
+      <w:r>
+        <w:t xml:space="preserve">instead of vanishing; the lifecycle log rotates at one megabyte; clearing the scan cache or the search index takes a second, sized click; the Edit menu shows the standard shortcuts the Help advertises; the menu that mirrors every pane’s buttons now skips the destructive ones. Three were verifications, not changes: the press never uses the reduced-battery escape hatch, the data-import hook is wired in every build, and the installed build’s data is release 0.27.2 (105,634 entries, 42,199 corpus segments), read from the database itself. The twelfth — whether both diagnostic reports, with their different privacy profiles, should ship — is a ruling I need from leadership.</w:t>
+      </w:r>
+    </w:p>
     <w:bookmarkEnd w:id="43"/>
-    <w:bookmarkStart w:id="44" w:name="decisions-i-made-along-the-way"/>
+    <w:bookmarkStart w:id="44" w:name="pressed-and-running"/>
+    <w:p>
+      <w:pPr>
+        <w:pStyle w:val="Heading3"/>
+      </w:pPr>
+      <w:r>
+        <w:t xml:space="preserve">Pressed and running</w:t>
+      </w:r>
+    </w:p>
+    <w:p>
+      <w:pPr>
+        <w:pStyle w:val="FirstParagraph"/>
+      </w:pPr>
+      <w:r>
+        <w:t xml:space="preserve">The whole batch is pressed, signed, verified and installed on my desktop (dev-ca74251, then a second press with the audit sweep). Every press ran the full battery, the constitution check and the visual-regression gate over the blessed panes before it was allowed to install.</w:t>
+      </w:r>
+    </w:p>
+    <w:bookmarkEnd w:id="44"/>
+    <w:bookmarkEnd w:id="45"/>
+    <w:bookmarkStart w:id="46" w:name="decisions-i-made-along-the-way"/>
     <w:p>
       <w:pPr>
         <w:pStyle w:val="Heading2"/>
@@ -1626,8 +1674,8 @@
         <w:t xml:space="preserve">text B and Reject All gives text A. No dead control in the meantime.</w:t>
       </w:r>
     </w:p>
-    <w:bookmarkEnd w:id="44"/>
-    <w:bookmarkStart w:id="48" w:name="numbers"/>
+    <w:bookmarkEnd w:id="46"/>
+    <w:bookmarkStart w:id="50" w:name="numbers"/>
     <w:p>
       <w:pPr>
         <w:pStyle w:val="Heading2"/>
@@ -1645,18 +1693,18 @@
           <wp:inline>
             <wp:extent cx="5334000" cy="2301240"/>
             <wp:effectExtent b="0" l="0" r="0" t="0"/>
-            <wp:docPr descr="Before and after, Monday 13:30 to now. Every count comes from the build itself: menus and pages from the running app, suites and checks from the test runner." title="" id="46" name="Picture"/>
+            <wp:docPr descr="Before and after, Monday 13:30 to now. Every count comes from the build itself: menus and pages from the running app, suites and checks from the test runner." title="" id="48" name="Picture"/>
             <a:graphic>
               <a:graphicData uri="http://schemas.openxmlformats.org/drawingml/2006/picture">
                 <pic:pic>
                   <pic:nvPicPr>
-                    <pic:cNvPr descr="img/2026-09-09/chart-numbers.png" id="47" name="Picture"/>
+                    <pic:cNvPr descr="img/2026-09-09/chart-numbers.png" id="49" name="Picture"/>
                     <pic:cNvPicPr>
                       <a:picLocks noChangeArrowheads="1" noChangeAspect="1"/>
                     </pic:cNvPicPr>
                   </pic:nvPicPr>
                   <pic:blipFill>
-                    <a:blip r:embed="rId45"/>
+                    <a:blip r:embed="rId47"/>
                     <a:stretch>
                       <a:fillRect/>
                     </a:stretch>
@@ -1873,7 +1921,7 @@
               <w:pStyle w:val="Compact"/>
             </w:pPr>
             <w:r>
-              <w:t xml:space="preserve">108, all green</w:t>
+              <w:t xml:space="preserve">109, all green</w:t>
             </w:r>
           </w:p>
         </w:tc>
@@ -2019,8 +2067,8 @@
         </w:tc>
       </w:tr>
     </w:tbl>
-    <w:bookmarkEnd w:id="48"/>
-    <w:bookmarkStart w:id="49" w:name="open-questions-for-leadership"/>
+    <w:bookmarkEnd w:id="50"/>
+    <w:bookmarkStart w:id="51" w:name="open-questions-for-leadership"/>
     <w:p>
       <w:pPr>
         <w:pStyle w:val="Heading2"/>
@@ -2286,8 +2334,8 @@
         <w:t xml:space="preserve">with a sample in Microsoft Word — before it appears in the menus.</w:t>
       </w:r>
     </w:p>
-    <w:bookmarkEnd w:id="49"/>
-    <w:bookmarkStart w:id="50" w:name="next"/>
+    <w:bookmarkEnd w:id="51"/>
+    <w:bookmarkStart w:id="52" w:name="next"/>
     <w:p>
       <w:pPr>
         <w:pStyle w:val="Heading2"/>
@@ -2328,8 +2376,8 @@
         <w:t xml:space="preserve">witnesses, the citation and reference bank).</w:t>
       </w:r>
     </w:p>
-    <w:bookmarkEnd w:id="50"/>
-    <w:bookmarkEnd w:id="51"/>
+    <w:bookmarkEnd w:id="52"/>
+    <w:bookmarkEnd w:id="53"/>
     <w:sectPr>
       <w:footnotePr>
         <w:numRestart w:val="eachSect"/>

</xml_diff>